<commit_message>
Improve RPD export formatting and navigation
</commit_message>
<xml_diff>
--- a/storage/app/templates/rpd/social.docx
+++ b/storage/app/templates/rpd/social.docx
@@ -703,9 +703,8 @@
           <w:sz w:val="28"/>
           <w:szCs w:val="28"/>
         </w:rPr>
-        <w:t>${</w:t>
-      </w:r>
-      <w:proofErr w:type="spellStart"/>
+        <w:t>${program_title}</w:t>
+      </w:r>
       <w:r>
         <w:rPr>
           <w:b/>
@@ -714,82 +713,43 @@
           <w:sz w:val="28"/>
           <w:szCs w:val="28"/>
         </w:rPr>
-        <w:t>program_title</w:t>
-      </w:r>
-      <w:proofErr w:type="spellEnd"/>
-      <w:r>
-        <w:rPr>
-          <w:b/>
+        <w:t>»</w:t>
+      </w:r>
+    </w:p>
+    <w:p>
+      <w:pPr>
+        <w:jc w:val="center"/>
+        <w:rPr>
           <w:bCs/>
-          <w:i/>
-          <w:sz w:val="28"/>
-          <w:szCs w:val="28"/>
-        </w:rPr>
-        <w:t>}</w:t>
-      </w:r>
-      <w:r>
-        <w:rPr>
-          <w:b/>
+          <w:sz w:val="28"/>
+          <w:szCs w:val="28"/>
+        </w:rPr>
+      </w:pPr>
+    </w:p>
+    <w:p>
+      <w:pPr>
+        <w:jc w:val="center"/>
+        <w:rPr>
           <w:bCs/>
-          <w:i/>
-          <w:sz w:val="28"/>
-          <w:szCs w:val="28"/>
-        </w:rPr>
-        <w:t>»</w:t>
-      </w:r>
-    </w:p>
-    <w:p>
-      <w:pPr>
-        <w:jc w:val="center"/>
+          <w:sz w:val="28"/>
+          <w:szCs w:val="28"/>
+        </w:rPr>
+      </w:pPr>
+      <w:r>
         <w:rPr>
           <w:bCs/>
           <w:sz w:val="28"/>
           <w:szCs w:val="28"/>
         </w:rPr>
-      </w:pPr>
-    </w:p>
-    <w:p>
-      <w:pPr>
-        <w:jc w:val="center"/>
+        <w:t xml:space="preserve">Уровень сложности: </w:t>
+      </w:r>
+      <w:r>
         <w:rPr>
           <w:bCs/>
           <w:sz w:val="28"/>
           <w:szCs w:val="28"/>
         </w:rPr>
-      </w:pPr>
-      <w:r>
-        <w:rPr>
-          <w:bCs/>
-          <w:sz w:val="28"/>
-          <w:szCs w:val="28"/>
-        </w:rPr>
-        <w:t xml:space="preserve">Уровень сложности: </w:t>
-      </w:r>
-      <w:r>
-        <w:rPr>
-          <w:bCs/>
-          <w:sz w:val="28"/>
-          <w:szCs w:val="28"/>
-        </w:rPr>
-        <w:t>${</w:t>
-      </w:r>
-      <w:proofErr w:type="spellStart"/>
-      <w:r>
-        <w:rPr>
-          <w:bCs/>
-          <w:sz w:val="28"/>
-          <w:szCs w:val="28"/>
-        </w:rPr>
-        <w:t>complexity_level</w:t>
-      </w:r>
-      <w:proofErr w:type="spellEnd"/>
-      <w:r>
-        <w:rPr>
-          <w:bCs/>
-          <w:sz w:val="28"/>
-          <w:szCs w:val="28"/>
-        </w:rPr>
-        <w:t>}</w:t>
+        <w:t>${complexity_level}</w:t>
       </w:r>
     </w:p>
     <w:p>
@@ -805,23 +765,7 @@
           <w:sz w:val="28"/>
           <w:highlight w:val="yellow"/>
         </w:rPr>
-        <w:t>${</w:t>
-      </w:r>
-      <w:proofErr w:type="spellStart"/>
-      <w:r>
-        <w:rPr>
-          <w:sz w:val="28"/>
-          <w:highlight w:val="yellow"/>
-        </w:rPr>
-        <w:t>smko_code</w:t>
-      </w:r>
-      <w:proofErr w:type="spellEnd"/>
-      <w:r>
-        <w:rPr>
-          <w:sz w:val="28"/>
-          <w:highlight w:val="yellow"/>
-        </w:rPr>
-        <w:t>}</w:t>
+        <w:t>${smko_code}</w:t>
       </w:r>
     </w:p>
     <w:p>
@@ -1070,23 +1014,7 @@
           <w:sz w:val="28"/>
           <w:szCs w:val="28"/>
         </w:rPr>
-        <w:t>${</w:t>
-      </w:r>
-      <w:proofErr w:type="spellStart"/>
-      <w:r>
-        <w:rPr>
-          <w:sz w:val="28"/>
-          <w:szCs w:val="28"/>
-        </w:rPr>
-        <w:t>program_title</w:t>
-      </w:r>
-      <w:proofErr w:type="spellEnd"/>
-      <w:r>
-        <w:rPr>
-          <w:sz w:val="28"/>
-          <w:szCs w:val="28"/>
-        </w:rPr>
-        <w:t>}</w:t>
+        <w:t>${program_title}</w:t>
       </w:r>
       <w:r>
         <w:rPr>
@@ -1441,39 +1369,7 @@
           <w:sz w:val="28"/>
           <w:szCs w:val="28"/>
         </w:rPr>
-        <w:t xml:space="preserve">Методических рекомендаций по проектированию дополнительных общеразвивающих программ (включая </w:t>
-      </w:r>
-      <w:proofErr w:type="spellStart"/>
-      <w:r>
-        <w:rPr>
-          <w:sz w:val="28"/>
-          <w:szCs w:val="28"/>
-        </w:rPr>
-        <w:t>разноуровневые</w:t>
-      </w:r>
-      <w:proofErr w:type="spellEnd"/>
-      <w:r>
-        <w:rPr>
-          <w:sz w:val="28"/>
-          <w:szCs w:val="28"/>
-        </w:rPr>
-        <w:t xml:space="preserve"> программы) (письмо </w:t>
-      </w:r>
-      <w:proofErr w:type="spellStart"/>
-      <w:r>
-        <w:rPr>
-          <w:sz w:val="28"/>
-          <w:szCs w:val="28"/>
-        </w:rPr>
-        <w:t>Минобрнауки</w:t>
-      </w:r>
-      <w:proofErr w:type="spellEnd"/>
-      <w:r>
-        <w:rPr>
-          <w:sz w:val="28"/>
-          <w:szCs w:val="28"/>
-        </w:rPr>
-        <w:t xml:space="preserve"> России от 18.11.2015 № 09–3242);</w:t>
+        <w:t>Методических рекомендаций по проектированию дополнительных общеразвивающих программ (включая разноуровневые программы) (письмо Минобрнауки России от 18.11.2015 № 09–3242);</w:t>
       </w:r>
     </w:p>
     <w:p>
@@ -1494,23 +1390,7 @@
           <w:sz w:val="28"/>
           <w:szCs w:val="28"/>
         </w:rPr>
-        <w:t xml:space="preserve">Письмом </w:t>
-      </w:r>
-      <w:proofErr w:type="spellStart"/>
-      <w:r>
-        <w:rPr>
-          <w:sz w:val="28"/>
-          <w:szCs w:val="28"/>
-        </w:rPr>
-        <w:t>Минобрнауки</w:t>
-      </w:r>
-      <w:proofErr w:type="spellEnd"/>
-      <w:r>
-        <w:rPr>
-          <w:sz w:val="28"/>
-          <w:szCs w:val="28"/>
-        </w:rPr>
-        <w:t xml:space="preserve"> России от 11.12.2006 № 06-1844 «О примерных требованиях к программам дополнительного образования детей»;</w:t>
+        <w:t>Письмом Минобрнауки России от 11.12.2006 № 06-1844 «О примерных требованиях к программам дополнительного образования детей»;</w:t>
       </w:r>
     </w:p>
     <w:p>
@@ -1840,23 +1720,7 @@
           <w:sz w:val="28"/>
           <w:szCs w:val="28"/>
         </w:rPr>
-        <w:t xml:space="preserve">творчеством обучающихся; расширить их возможности информационно-технической адаптации посредством формирования базы знаний и навыков в области основ современных технологий; достижение обучающимися планируемых </w:t>
-      </w:r>
-      <w:proofErr w:type="spellStart"/>
-      <w:r>
-        <w:rPr>
-          <w:sz w:val="28"/>
-          <w:szCs w:val="28"/>
-        </w:rPr>
-        <w:t>метапредметных</w:t>
-      </w:r>
-      <w:proofErr w:type="spellEnd"/>
-      <w:r>
-        <w:rPr>
-          <w:sz w:val="28"/>
-          <w:szCs w:val="28"/>
-        </w:rPr>
-        <w:t xml:space="preserve"> и предметных результатов; создание комплекса психолого-педагогических мер, направленных на профессиональное самоопределение школьника.</w:t>
+        <w:t>творчеством обучающихся; расширить их возможности информационно-технической адаптации посредством формирования базы знаний и навыков в области основ современных технологий; достижение обучающимися планируемых метапредметных и предметных результатов; создание комплекса психолого-педагогических мер, направленных на профессиональное самоопределение школьника.</w:t>
       </w:r>
     </w:p>
     <w:p>
@@ -2723,21 +2587,12 @@
           <w:szCs w:val="28"/>
         </w:rPr>
       </w:pPr>
-      <w:proofErr w:type="spellStart"/>
-      <w:r>
-        <w:rPr>
-          <w:sz w:val="28"/>
-          <w:szCs w:val="28"/>
-        </w:rPr>
-        <w:t>Метапредметные</w:t>
-      </w:r>
-      <w:proofErr w:type="spellEnd"/>
-      <w:r>
-        <w:rPr>
-          <w:sz w:val="28"/>
-          <w:szCs w:val="28"/>
-        </w:rPr>
-        <w:t>:</w:t>
+      <w:r>
+        <w:rPr>
+          <w:sz w:val="28"/>
+          <w:szCs w:val="28"/>
+        </w:rPr>
+        <w:t>Метапредметные:</w:t>
       </w:r>
     </w:p>
     <w:p>
@@ -3054,23 +2909,7 @@
           <w:b w:val="0"/>
           <w:bCs w:val="0"/>
         </w:rPr>
-        <w:t>${</w:t>
-      </w:r>
-      <w:proofErr w:type="spellStart"/>
-      <w:r>
-        <w:rPr>
-          <w:b w:val="0"/>
-          <w:bCs w:val="0"/>
-        </w:rPr>
-        <w:t>total_hours</w:t>
-      </w:r>
-      <w:proofErr w:type="spellEnd"/>
-      <w:r>
-        <w:rPr>
-          <w:b w:val="0"/>
-          <w:bCs w:val="0"/>
-        </w:rPr>
-        <w:t>}</w:t>
+        <w:t>${total_hours}</w:t>
       </w:r>
       <w:r>
         <w:rPr>
@@ -3116,17 +2955,8 @@
           <w:b w:val="0"/>
           <w:bCs w:val="0"/>
         </w:rPr>
-        <w:t>${</w:t>
-      </w:r>
-      <w:proofErr w:type="spellStart"/>
-      <w:r>
-        <w:rPr>
-          <w:b w:val="0"/>
-          <w:bCs w:val="0"/>
-        </w:rPr>
-        <w:t>education_form</w:t>
-      </w:r>
-      <w:proofErr w:type="spellEnd"/>
+        <w:t>${education_form</w:t>
+      </w:r>
       <w:r>
         <w:rPr>
           <w:b w:val="0"/>
@@ -3192,17 +3022,8 @@
           <w:sz w:val="28"/>
           <w:szCs w:val="28"/>
         </w:rPr>
-        <w:t>${</w:t>
-      </w:r>
-      <w:proofErr w:type="spellStart"/>
-      <w:r>
-        <w:rPr>
-          <w:sz w:val="28"/>
-          <w:szCs w:val="28"/>
-        </w:rPr>
-        <w:t>study_mode</w:t>
-      </w:r>
-      <w:proofErr w:type="spellEnd"/>
+        <w:t>${study_mode</w:t>
+      </w:r>
       <w:r>
         <w:rPr>
           <w:sz w:val="28"/>
@@ -4386,23 +4207,7 @@
                 <w:b/>
                 <w:bCs/>
               </w:rPr>
-              <w:t>${</w:t>
-            </w:r>
-            <w:proofErr w:type="spellStart"/>
-            <w:r>
-              <w:rPr>
-                <w:b/>
-                <w:bCs/>
-              </w:rPr>
-              <w:t>curriculum_number</w:t>
-            </w:r>
-            <w:proofErr w:type="spellEnd"/>
-            <w:r>
-              <w:rPr>
-                <w:b/>
-                <w:bCs/>
-              </w:rPr>
-              <w:t>}</w:t>
+              <w:t>${curriculum_number}</w:t>
             </w:r>
           </w:p>
         </w:tc>
@@ -4415,15 +4220,7 @@
               <w:pStyle w:val="p1"/>
             </w:pPr>
             <w:r>
-              <w:t>${</w:t>
-            </w:r>
-            <w:proofErr w:type="spellStart"/>
-            <w:r>
-              <w:t>curriculum_title</w:t>
-            </w:r>
-            <w:proofErr w:type="spellEnd"/>
-            <w:r>
-              <w:t>}</w:t>
+              <w:t>${curriculum_title}</w:t>
             </w:r>
           </w:p>
         </w:tc>
@@ -4436,15 +4233,7 @@
               <w:pStyle w:val="p1"/>
             </w:pPr>
             <w:r>
-              <w:t>${</w:t>
-            </w:r>
-            <w:proofErr w:type="spellStart"/>
-            <w:r>
-              <w:t>curriculum_total_hours</w:t>
-            </w:r>
-            <w:proofErr w:type="spellEnd"/>
-            <w:r>
-              <w:t>}</w:t>
+              <w:t>${curriculum_total_hours}</w:t>
             </w:r>
           </w:p>
         </w:tc>
@@ -4457,15 +4246,7 @@
               <w:pStyle w:val="p1"/>
             </w:pPr>
             <w:r>
-              <w:t>${</w:t>
-            </w:r>
-            <w:proofErr w:type="spellStart"/>
-            <w:r>
-              <w:t>curriculum_theory_hours</w:t>
-            </w:r>
-            <w:proofErr w:type="spellEnd"/>
-            <w:r>
-              <w:t>}</w:t>
+              <w:t>${curriculum_theory_hours}</w:t>
             </w:r>
           </w:p>
         </w:tc>
@@ -4478,15 +4259,7 @@
               <w:pStyle w:val="p1"/>
             </w:pPr>
             <w:r>
-              <w:t>${</w:t>
-            </w:r>
-            <w:proofErr w:type="spellStart"/>
-            <w:r>
-              <w:t>curriculum_practice_hours</w:t>
-            </w:r>
-            <w:proofErr w:type="spellEnd"/>
-            <w:r>
-              <w:t>}</w:t>
+              <w:t>${curriculum_practice_hours}</w:t>
             </w:r>
           </w:p>
         </w:tc>
@@ -4499,15 +4272,7 @@
               <w:pStyle w:val="p1"/>
             </w:pPr>
             <w:r>
-              <w:t>${</w:t>
-            </w:r>
-            <w:proofErr w:type="spellStart"/>
-            <w:r>
-              <w:t>curriculum_control</w:t>
-            </w:r>
-            <w:proofErr w:type="spellEnd"/>
-            <w:r>
-              <w:t>}</w:t>
+              <w:t>${curriculum_control}</w:t>
             </w:r>
           </w:p>
         </w:tc>
@@ -4564,23 +4329,7 @@
                 <w:b/>
                 <w:bCs/>
               </w:rPr>
-              <w:t>${</w:t>
-            </w:r>
-            <w:proofErr w:type="spellStart"/>
-            <w:r>
-              <w:rPr>
-                <w:b/>
-                <w:bCs/>
-              </w:rPr>
-              <w:t>curriculum_total_sum</w:t>
-            </w:r>
-            <w:proofErr w:type="spellEnd"/>
-            <w:r>
-              <w:rPr>
-                <w:b/>
-                <w:bCs/>
-              </w:rPr>
-              <w:t>}</w:t>
+              <w:t>${curriculum_total_sum}</w:t>
             </w:r>
           </w:p>
         </w:tc>
@@ -4597,23 +4346,7 @@
                 <w:b/>
                 <w:bCs/>
               </w:rPr>
-              <w:t>${</w:t>
-            </w:r>
-            <w:proofErr w:type="spellStart"/>
-            <w:r>
-              <w:rPr>
-                <w:b/>
-                <w:bCs/>
-              </w:rPr>
-              <w:t>curriculum_theory_sum</w:t>
-            </w:r>
-            <w:proofErr w:type="spellEnd"/>
-            <w:r>
-              <w:rPr>
-                <w:b/>
-                <w:bCs/>
-              </w:rPr>
-              <w:t>}</w:t>
+              <w:t>${curriculum_theory_sum}</w:t>
             </w:r>
           </w:p>
         </w:tc>
@@ -4630,23 +4363,7 @@
                 <w:b/>
                 <w:bCs/>
               </w:rPr>
-              <w:t>${</w:t>
-            </w:r>
-            <w:proofErr w:type="spellStart"/>
-            <w:r>
-              <w:rPr>
-                <w:b/>
-                <w:bCs/>
-              </w:rPr>
-              <w:t>curriculum_practice_sum</w:t>
-            </w:r>
-            <w:proofErr w:type="spellEnd"/>
-            <w:r>
-              <w:rPr>
-                <w:b/>
-                <w:bCs/>
-              </w:rPr>
-              <w:t>}</w:t>
+              <w:t>${curriculum_practice_sum}</w:t>
             </w:r>
           </w:p>
         </w:tc>
@@ -4742,25 +4459,7 @@
           <w:szCs w:val="24"/>
           <w:lang w:val="en-US"/>
         </w:rPr>
-        <w:t>${</w:t>
-      </w:r>
-      <w:proofErr w:type="spellStart"/>
-      <w:r>
-        <w:rPr>
-          <w:sz w:val="24"/>
-          <w:szCs w:val="24"/>
-          <w:lang w:val="en-US"/>
-        </w:rPr>
-        <w:t>schedule_table</w:t>
-      </w:r>
-      <w:proofErr w:type="spellEnd"/>
-      <w:r>
-        <w:rPr>
-          <w:sz w:val="24"/>
-          <w:szCs w:val="24"/>
-          <w:lang w:val="en-US"/>
-        </w:rPr>
-        <w:t>}</w:t>
+        <w:t>${schedule_table}</w:t>
       </w:r>
     </w:p>
     <w:p>
@@ -4958,15 +4657,7 @@
               <w:pStyle w:val="p1"/>
             </w:pPr>
             <w:r>
-              <w:t>${</w:t>
-            </w:r>
-            <w:proofErr w:type="spellStart"/>
-            <w:r>
-              <w:t>content_title</w:t>
-            </w:r>
-            <w:proofErr w:type="spellEnd"/>
-            <w:r>
-              <w:t>}</w:t>
+              <w:t>${content_title}</w:t>
             </w:r>
           </w:p>
         </w:tc>
@@ -4979,15 +4670,7 @@
               <w:pStyle w:val="p1"/>
             </w:pPr>
             <w:r>
-              <w:t>${</w:t>
-            </w:r>
-            <w:proofErr w:type="spellStart"/>
-            <w:r>
-              <w:t>content_text</w:t>
-            </w:r>
-            <w:proofErr w:type="spellEnd"/>
-            <w:r>
-              <w:t>}</w:t>
+              <w:t>${content_text}</w:t>
             </w:r>
           </w:p>
         </w:tc>
@@ -6578,39 +6261,7 @@
           <w:sz w:val="28"/>
           <w:szCs w:val="28"/>
         </w:rPr>
-        <w:t xml:space="preserve">области и степени освоения основных </w:t>
-      </w:r>
-      <w:proofErr w:type="spellStart"/>
-      <w:r>
-        <w:rPr>
-          <w:sz w:val="28"/>
-          <w:szCs w:val="28"/>
-        </w:rPr>
-        <w:t>общеучебных</w:t>
-      </w:r>
-      <w:proofErr w:type="spellEnd"/>
-      <w:r>
-        <w:rPr>
-          <w:sz w:val="28"/>
-          <w:szCs w:val="28"/>
-        </w:rPr>
-        <w:t xml:space="preserve"> компетенций, т. е. </w:t>
-      </w:r>
-      <w:proofErr w:type="spellStart"/>
-      <w:r>
-        <w:rPr>
-          <w:sz w:val="28"/>
-          <w:szCs w:val="28"/>
-        </w:rPr>
-        <w:t>компетентностный</w:t>
-      </w:r>
-      <w:proofErr w:type="spellEnd"/>
-      <w:r>
-        <w:rPr>
-          <w:sz w:val="28"/>
-          <w:szCs w:val="28"/>
-        </w:rPr>
-        <w:t xml:space="preserve"> </w:t>
+        <w:t xml:space="preserve">области и степени освоения основных общеучебных компетенций, т. е. компетентностный </w:t>
       </w:r>
       <w:r>
         <w:rPr>
@@ -6637,23 +6288,7 @@
           <w:sz w:val="28"/>
           <w:szCs w:val="28"/>
         </w:rPr>
-        <w:t xml:space="preserve">Основополагающими критериями эффективности реализации образовательной программы с точки зрения </w:t>
-      </w:r>
-      <w:proofErr w:type="spellStart"/>
-      <w:r>
-        <w:rPr>
-          <w:sz w:val="28"/>
-          <w:szCs w:val="28"/>
-        </w:rPr>
-        <w:t>компетентностного</w:t>
-      </w:r>
-      <w:proofErr w:type="spellEnd"/>
-      <w:r>
-        <w:rPr>
-          <w:sz w:val="28"/>
-          <w:szCs w:val="28"/>
-        </w:rPr>
-        <w:t xml:space="preserve"> подхода является:</w:t>
+        <w:t>Основополагающими критериями эффективности реализации образовательной программы с точки зрения компетентностного подхода является:</w:t>
       </w:r>
     </w:p>
     <w:p>
@@ -6685,7 +6320,6 @@
         </w:rPr>
         <w:t xml:space="preserve"> </w:t>
       </w:r>
-      <w:proofErr w:type="spellStart"/>
       <w:r>
         <w:rPr>
           <w:sz w:val="28"/>
@@ -6693,7 +6327,6 @@
         </w:rPr>
         <w:t>сформированности</w:t>
       </w:r>
-      <w:proofErr w:type="spellEnd"/>
       <w:r>
         <w:rPr>
           <w:spacing w:val="-3"/>
@@ -10305,25 +9938,7 @@
           <w:sz w:val="28"/>
           <w:szCs w:val="28"/>
         </w:rPr>
-        <w:t xml:space="preserve"> «</w:t>
-      </w:r>
-      <w:proofErr w:type="spellStart"/>
-      <w:r>
-        <w:rPr>
-          <w:spacing w:val="-2"/>
-          <w:sz w:val="28"/>
-          <w:szCs w:val="28"/>
-        </w:rPr>
-        <w:t>незачтено</w:t>
-      </w:r>
-      <w:proofErr w:type="spellEnd"/>
-      <w:r>
-        <w:rPr>
-          <w:spacing w:val="-2"/>
-          <w:sz w:val="28"/>
-          <w:szCs w:val="28"/>
-        </w:rPr>
-        <w:t>»;</w:t>
+        <w:t xml:space="preserve"> «незачтено»;</w:t>
       </w:r>
     </w:p>
     <w:p>
@@ -10522,23 +10137,7 @@
           <w:szCs w:val="28"/>
         </w:rPr>
         <w:lastRenderedPageBreak/>
-        <w:t>«</w:t>
-      </w:r>
-      <w:proofErr w:type="spellStart"/>
-      <w:r>
-        <w:rPr>
-          <w:sz w:val="28"/>
-          <w:szCs w:val="28"/>
-        </w:rPr>
-        <w:t>незачтено</w:t>
-      </w:r>
-      <w:proofErr w:type="spellEnd"/>
-      <w:r>
-        <w:rPr>
-          <w:sz w:val="28"/>
-          <w:szCs w:val="28"/>
-        </w:rPr>
-        <w:t>».</w:t>
+        <w:t>«незачтено».</w:t>
       </w:r>
     </w:p>
     <w:p>
@@ -11201,27 +10800,7 @@
           <w:szCs w:val="2"/>
           <w:lang w:val="en-US"/>
         </w:rPr>
-        <w:t>${</w:t>
-      </w:r>
-      <w:proofErr w:type="spellStart"/>
-      <w:r>
-        <w:rPr>
-          <w:color w:val="FF0000"/>
-          <w:sz w:val="2"/>
-          <w:szCs w:val="2"/>
-          <w:lang w:val="en-US"/>
-        </w:rPr>
-        <w:t>control_survey_materials_block</w:t>
-      </w:r>
-      <w:proofErr w:type="spellEnd"/>
-      <w:r>
-        <w:rPr>
-          <w:color w:val="FF0000"/>
-          <w:sz w:val="2"/>
-          <w:szCs w:val="2"/>
-          <w:lang w:val="en-US"/>
-        </w:rPr>
-        <w:t>}</w:t>
+        <w:t>${control_survey_materials_block}</w:t>
       </w:r>
     </w:p>
     <w:p>
@@ -11248,25 +10827,7 @@
           <w:szCs w:val="28"/>
           <w:lang w:val="en-US"/>
         </w:rPr>
-        <w:t>${</w:t>
-      </w:r>
-      <w:proofErr w:type="spellStart"/>
-      <w:r>
-        <w:rPr>
-          <w:sz w:val="28"/>
-          <w:szCs w:val="28"/>
-          <w:lang w:val="en-US"/>
-        </w:rPr>
-        <w:t>control_survey_materials_text</w:t>
-      </w:r>
-      <w:proofErr w:type="spellEnd"/>
-      <w:r>
-        <w:rPr>
-          <w:sz w:val="28"/>
-          <w:szCs w:val="28"/>
-          <w:lang w:val="en-US"/>
-        </w:rPr>
-        <w:t>}</w:t>
+        <w:t>${control_survey_materials_text}</w:t>
       </w:r>
     </w:p>
     <w:p>
@@ -11287,25 +10848,7 @@
           <w:sz w:val="2"/>
           <w:szCs w:val="2"/>
         </w:rPr>
-        <w:t>${/</w:t>
-      </w:r>
-      <w:proofErr w:type="spellStart"/>
-      <w:r>
-        <w:rPr>
-          <w:color w:val="FF0000"/>
-          <w:sz w:val="2"/>
-          <w:szCs w:val="2"/>
-        </w:rPr>
-        <w:t>control_survey_materials_block</w:t>
-      </w:r>
-      <w:proofErr w:type="spellEnd"/>
-      <w:r>
-        <w:rPr>
-          <w:color w:val="FF0000"/>
-          <w:sz w:val="2"/>
-          <w:szCs w:val="2"/>
-        </w:rPr>
-        <w:t>}</w:t>
+        <w:t>${/control_survey_materials_block}</w:t>
       </w:r>
     </w:p>
     <w:p>
@@ -11387,27 +10930,7 @@
           <w:szCs w:val="2"/>
           <w:lang w:val="en-US"/>
         </w:rPr>
-        <w:t>${</w:t>
-      </w:r>
-      <w:proofErr w:type="spellStart"/>
-      <w:r>
-        <w:rPr>
-          <w:color w:val="FF0000"/>
-          <w:sz w:val="2"/>
-          <w:szCs w:val="2"/>
-          <w:lang w:val="en-US"/>
-        </w:rPr>
-        <w:t>final_practical_work_materials_block</w:t>
-      </w:r>
-      <w:proofErr w:type="spellEnd"/>
-      <w:r>
-        <w:rPr>
-          <w:color w:val="FF0000"/>
-          <w:sz w:val="2"/>
-          <w:szCs w:val="2"/>
-          <w:lang w:val="en-US"/>
-        </w:rPr>
-        <w:t>}</w:t>
+        <w:t>${final_practical_work_materials_block}</w:t>
       </w:r>
     </w:p>
     <w:p>
@@ -11434,25 +10957,7 @@
           <w:szCs w:val="28"/>
           <w:lang w:val="en-US"/>
         </w:rPr>
-        <w:t>${</w:t>
-      </w:r>
-      <w:proofErr w:type="spellStart"/>
-      <w:r>
-        <w:rPr>
-          <w:sz w:val="28"/>
-          <w:szCs w:val="28"/>
-          <w:lang w:val="en-US"/>
-        </w:rPr>
-        <w:t>final_practical_work_materials_text</w:t>
-      </w:r>
-      <w:proofErr w:type="spellEnd"/>
-      <w:r>
-        <w:rPr>
-          <w:sz w:val="28"/>
-          <w:szCs w:val="28"/>
-          <w:lang w:val="en-US"/>
-        </w:rPr>
-        <w:t>}</w:t>
+        <w:t>${final_practical_work_materials_text}</w:t>
       </w:r>
     </w:p>
     <w:p>
@@ -11475,27 +10980,7 @@
           <w:szCs w:val="2"/>
           <w:lang w:val="en-US"/>
         </w:rPr>
-        <w:t>${/</w:t>
-      </w:r>
-      <w:proofErr w:type="spellStart"/>
-      <w:r>
-        <w:rPr>
-          <w:color w:val="FF0000"/>
-          <w:sz w:val="2"/>
-          <w:szCs w:val="2"/>
-          <w:lang w:val="en-US"/>
-        </w:rPr>
-        <w:t>final_practical_work_materials_block</w:t>
-      </w:r>
-      <w:proofErr w:type="spellEnd"/>
-      <w:r>
-        <w:rPr>
-          <w:color w:val="FF0000"/>
-          <w:sz w:val="2"/>
-          <w:szCs w:val="2"/>
-          <w:lang w:val="en-US"/>
-        </w:rPr>
-        <w:t>}</w:t>
+        <w:t>${/final_practical_work_materials_block}</w:t>
       </w:r>
     </w:p>
     <w:p>
@@ -11623,25 +11108,7 @@
           <w:szCs w:val="28"/>
           <w:lang w:val="en-US"/>
         </w:rPr>
-        <w:t>${</w:t>
-      </w:r>
-      <w:proofErr w:type="spellStart"/>
-      <w:r>
-        <w:rPr>
-          <w:sz w:val="28"/>
-          <w:szCs w:val="28"/>
-          <w:lang w:val="en-US"/>
-        </w:rPr>
-        <w:t>project_topics_text</w:t>
-      </w:r>
-      <w:proofErr w:type="spellEnd"/>
-      <w:r>
-        <w:rPr>
-          <w:sz w:val="28"/>
-          <w:szCs w:val="28"/>
-          <w:lang w:val="en-US"/>
-        </w:rPr>
-        <w:t>}</w:t>
+        <w:t>${project_topics_text}</w:t>
       </w:r>
     </w:p>
     <w:p>
@@ -11864,23 +11331,7 @@
           <w:sz w:val="28"/>
           <w:szCs w:val="28"/>
         </w:rPr>
-        <w:t>${</w:t>
-      </w:r>
-      <w:proofErr w:type="spellStart"/>
-      <w:r>
-        <w:rPr>
-          <w:sz w:val="28"/>
-          <w:szCs w:val="28"/>
-        </w:rPr>
-        <w:t>main_recommended_resources_text</w:t>
-      </w:r>
-      <w:proofErr w:type="spellEnd"/>
-      <w:r>
-        <w:rPr>
-          <w:sz w:val="28"/>
-          <w:szCs w:val="28"/>
-        </w:rPr>
-        <w:t>}</w:t>
+        <w:t>${main_recommended_resources_text}</w:t>
       </w:r>
     </w:p>
     <w:p>
@@ -11899,25 +11350,7 @@
           <w:sz w:val="2"/>
           <w:szCs w:val="2"/>
         </w:rPr>
-        <w:t>${/</w:t>
-      </w:r>
-      <w:proofErr w:type="spellStart"/>
-      <w:r>
-        <w:rPr>
-          <w:color w:val="FF0000"/>
-          <w:sz w:val="2"/>
-          <w:szCs w:val="2"/>
-        </w:rPr>
-        <w:t>main_recommended_resources_block</w:t>
-      </w:r>
-      <w:proofErr w:type="spellEnd"/>
-      <w:r>
-        <w:rPr>
-          <w:color w:val="FF0000"/>
-          <w:sz w:val="2"/>
-          <w:szCs w:val="2"/>
-        </w:rPr>
-        <w:t>}</w:t>
+        <w:t>${/main_recommended_resources_block}</w:t>
       </w:r>
     </w:p>
     <w:p>
@@ -11964,25 +11397,7 @@
           <w:sz w:val="2"/>
           <w:szCs w:val="2"/>
         </w:rPr>
-        <w:t>${</w:t>
-      </w:r>
-      <w:proofErr w:type="spellStart"/>
-      <w:r>
-        <w:rPr>
-          <w:color w:val="FF0000"/>
-          <w:sz w:val="2"/>
-          <w:szCs w:val="2"/>
-        </w:rPr>
-        <w:t>additional_resources_block</w:t>
-      </w:r>
-      <w:proofErr w:type="spellEnd"/>
-      <w:r>
-        <w:rPr>
-          <w:color w:val="FF0000"/>
-          <w:sz w:val="2"/>
-          <w:szCs w:val="2"/>
-        </w:rPr>
-        <w:t>}</w:t>
+        <w:t>${additional_resources_block}</w:t>
       </w:r>
     </w:p>
     <w:p>
@@ -12004,23 +11419,7 @@
           <w:sz w:val="28"/>
           <w:szCs w:val="28"/>
         </w:rPr>
-        <w:t>${</w:t>
-      </w:r>
-      <w:proofErr w:type="spellStart"/>
-      <w:r>
-        <w:rPr>
-          <w:sz w:val="28"/>
-          <w:szCs w:val="28"/>
-        </w:rPr>
-        <w:t>additional_resources_text</w:t>
-      </w:r>
-      <w:proofErr w:type="spellEnd"/>
-      <w:r>
-        <w:rPr>
-          <w:sz w:val="28"/>
-          <w:szCs w:val="28"/>
-        </w:rPr>
-        <w:t>}</w:t>
+        <w:t>${additional_resources_text}</w:t>
       </w:r>
     </w:p>
     <w:p>
@@ -12039,25 +11438,7 @@
           <w:szCs w:val="2"/>
         </w:rPr>
         <w:lastRenderedPageBreak/>
-        <w:t>${/</w:t>
-      </w:r>
-      <w:proofErr w:type="spellStart"/>
-      <w:r>
-        <w:rPr>
-          <w:color w:val="FF0000"/>
-          <w:sz w:val="2"/>
-          <w:szCs w:val="2"/>
-        </w:rPr>
-        <w:t>additional_resources_block</w:t>
-      </w:r>
-      <w:proofErr w:type="spellEnd"/>
-      <w:r>
-        <w:rPr>
-          <w:color w:val="FF0000"/>
-          <w:sz w:val="2"/>
-          <w:szCs w:val="2"/>
-        </w:rPr>
-        <w:t>}</w:t>
+        <w:t>${/additional_resources_block}</w:t>
       </w:r>
     </w:p>
     <w:p>
@@ -12132,25 +11513,7 @@
           <w:sz w:val="2"/>
           <w:szCs w:val="2"/>
         </w:rPr>
-        <w:t>${</w:t>
-      </w:r>
-      <w:proofErr w:type="spellStart"/>
-      <w:r>
-        <w:rPr>
-          <w:color w:val="FF0000"/>
-          <w:sz w:val="2"/>
-          <w:szCs w:val="2"/>
-        </w:rPr>
-        <w:t>internet_resources_block</w:t>
-      </w:r>
-      <w:proofErr w:type="spellEnd"/>
-      <w:r>
-        <w:rPr>
-          <w:color w:val="FF0000"/>
-          <w:sz w:val="2"/>
-          <w:szCs w:val="2"/>
-        </w:rPr>
-        <w:t>}</w:t>
+        <w:t>${internet_resources_block}</w:t>
       </w:r>
     </w:p>
     <w:p>
@@ -12172,23 +11535,7 @@
           <w:sz w:val="28"/>
           <w:szCs w:val="28"/>
         </w:rPr>
-        <w:t>${</w:t>
-      </w:r>
-      <w:proofErr w:type="spellStart"/>
-      <w:r>
-        <w:rPr>
-          <w:sz w:val="28"/>
-          <w:szCs w:val="28"/>
-        </w:rPr>
-        <w:t>internet_resources_text</w:t>
-      </w:r>
-      <w:proofErr w:type="spellEnd"/>
-      <w:r>
-        <w:rPr>
-          <w:sz w:val="28"/>
-          <w:szCs w:val="28"/>
-        </w:rPr>
-        <w:t>}</w:t>
+        <w:t>${internet_resources_text}</w:t>
       </w:r>
     </w:p>
     <w:p>
@@ -12207,25 +11554,7 @@
           <w:sz w:val="2"/>
           <w:szCs w:val="2"/>
         </w:rPr>
-        <w:t>${/</w:t>
-      </w:r>
-      <w:proofErr w:type="spellStart"/>
-      <w:r>
-        <w:rPr>
-          <w:color w:val="FF0000"/>
-          <w:sz w:val="2"/>
-          <w:szCs w:val="2"/>
-        </w:rPr>
-        <w:t>internet_resources_block</w:t>
-      </w:r>
-      <w:proofErr w:type="spellEnd"/>
-      <w:r>
-        <w:rPr>
-          <w:color w:val="FF0000"/>
-          <w:sz w:val="2"/>
-          <w:szCs w:val="2"/>
-        </w:rPr>
-        <w:t>}</w:t>
+        <w:t>${/internet_resources_block}</w:t>
       </w:r>
     </w:p>
     <w:p>
@@ -12286,23 +11615,7 @@
                 <w:sz w:val="28"/>
                 <w:szCs w:val="28"/>
               </w:rPr>
-              <w:t>${</w:t>
-            </w:r>
-            <w:proofErr w:type="spellStart"/>
-            <w:r>
-              <w:rPr>
-                <w:sz w:val="28"/>
-                <w:szCs w:val="28"/>
-              </w:rPr>
-              <w:t>author_position</w:t>
-            </w:r>
-            <w:proofErr w:type="spellEnd"/>
-            <w:r>
-              <w:rPr>
-                <w:sz w:val="28"/>
-                <w:szCs w:val="28"/>
-              </w:rPr>
-              <w:t>}</w:t>
+              <w:t>${author_position}</w:t>
             </w:r>
           </w:p>
         </w:tc>
@@ -12343,23 +11656,7 @@
                 <w:sz w:val="28"/>
                 <w:szCs w:val="28"/>
               </w:rPr>
-              <w:t>${</w:t>
-            </w:r>
-            <w:proofErr w:type="spellStart"/>
-            <w:r>
-              <w:rPr>
-                <w:sz w:val="28"/>
-                <w:szCs w:val="28"/>
-              </w:rPr>
-              <w:t>author_name</w:t>
-            </w:r>
-            <w:proofErr w:type="spellEnd"/>
-            <w:r>
-              <w:rPr>
-                <w:sz w:val="28"/>
-                <w:szCs w:val="28"/>
-              </w:rPr>
-              <w:t>}</w:t>
+              <w:t>${author_name}</w:t>
             </w:r>
           </w:p>
         </w:tc>
@@ -12638,25 +11935,7 @@
               <w:szCs w:val="20"/>
               <w:lang w:val="en-US"/>
             </w:rPr>
-            <w:t>${</w:t>
-          </w:r>
-          <w:proofErr w:type="spellStart"/>
-          <w:r>
-            <w:rPr>
-              <w:sz w:val="20"/>
-              <w:szCs w:val="20"/>
-              <w:lang w:val="en-US"/>
-            </w:rPr>
-            <w:t>program_title</w:t>
-          </w:r>
-          <w:proofErr w:type="spellEnd"/>
-          <w:r>
-            <w:rPr>
-              <w:sz w:val="20"/>
-              <w:szCs w:val="20"/>
-              <w:lang w:val="en-US"/>
-            </w:rPr>
-            <w:t>}</w:t>
+            <w:t>${program_title}</w:t>
           </w:r>
           <w:r>
             <w:rPr>
@@ -12710,27 +11989,8 @@
             <w:rPr>
               <w:sz w:val="24"/>
               <w:szCs w:val="24"/>
-              <w:highlight w:val="yellow"/>
             </w:rPr>
-            <w:t>${</w:t>
-          </w:r>
-          <w:proofErr w:type="spellStart"/>
-          <w:r>
-            <w:rPr>
-              <w:sz w:val="24"/>
-              <w:szCs w:val="24"/>
-              <w:highlight w:val="yellow"/>
-            </w:rPr>
-            <w:t>smko_code</w:t>
-          </w:r>
-          <w:proofErr w:type="spellEnd"/>
-          <w:r>
-            <w:rPr>
-              <w:sz w:val="24"/>
-              <w:szCs w:val="24"/>
-              <w:highlight w:val="yellow"/>
-            </w:rPr>
-            <w:t>}</w:t>
+            <w:t>${smko_code}</w:t>
           </w:r>
         </w:p>
       </w:tc>

</xml_diff>